<commit_message>
Add configurable filters, launcher, and docs
</commit_message>
<xml_diff>
--- a/auto-emailer-linkedin/assets/Rithwik_Raj_Mallam__Resume.docx
+++ b/auto-emailer-linkedin/assets/Rithwik_Raj_Mallam__Resume.docx
@@ -182,27 +182,7 @@
             <w:szCs w:val="24"/>
             <w:u w:val="single"/>
           </w:rPr>
-          <w:t>Portfo</w:t>
-        </w:r>
-        <w:r>
-          <w:rPr>
-            <w:rFonts w:ascii="Times New Roman" w:eastAsia="Times New Roman" w:hAnsi="Times New Roman" w:cs="Times New Roman"/>
-            <w:color w:val="0000FF"/>
-            <w:sz w:val="24"/>
-            <w:szCs w:val="24"/>
-            <w:u w:val="single"/>
-          </w:rPr>
-          <w:t>l</w:t>
-        </w:r>
-        <w:r>
-          <w:rPr>
-            <w:rFonts w:ascii="Times New Roman" w:eastAsia="Times New Roman" w:hAnsi="Times New Roman" w:cs="Times New Roman"/>
-            <w:color w:val="0000FF"/>
-            <w:sz w:val="24"/>
-            <w:szCs w:val="24"/>
-            <w:u w:val="single"/>
-          </w:rPr>
-          <w:t>io</w:t>
+          <w:t>Portfolio</w:t>
         </w:r>
       </w:hyperlink>
       <w:r>
@@ -254,113 +234,15 @@
           <w:sz w:val="24"/>
           <w:szCs w:val="24"/>
         </w:rPr>
-        <w:t xml:space="preserve">Innovative and results-driven </w:t>
+        <w:t>Innovative and results-driven Software Development Engineer with 4 years of experience delivering enterprise-scale applications across full-stack and backend environments. Skilled in Java (Spring Boot), C#, Python, and Angular, with additional experience leveraging Generative AI and LLM technologies such as Azure OpenAI, RAG, and prompt engineering to enhance automation and developer productivity. Adept at system design, cloud-native deployments (AWS, Azure, Kubernetes), and building resilient applications using RESTful APIs, Kafka event-driven architectures, and end-to-end CI/CD pipelines. Strong collaborator with product, business, and engineering teams to deliver secure, scalable, and user-focused solutions</w:t>
       </w:r>
       <w:r>
         <w:rPr>
           <w:rFonts w:ascii="Times New Roman" w:eastAsia="Times New Roman" w:hAnsi="Times New Roman" w:cs="Times New Roman"/>
-          <w:b/>
-          <w:bCs/>
-          <w:sz w:val="24"/>
-          <w:szCs w:val="24"/>
-        </w:rPr>
-        <w:t>Software Development Engineer</w:t>
-      </w:r>
-      <w:r>
-        <w:rPr>
-          <w:rFonts w:ascii="Times New Roman" w:eastAsia="Times New Roman" w:hAnsi="Times New Roman" w:cs="Times New Roman"/>
-          <w:sz w:val="24"/>
-          <w:szCs w:val="24"/>
-        </w:rPr>
-        <w:t xml:space="preserve"> with </w:t>
-      </w:r>
-      <w:r>
-        <w:rPr>
-          <w:rFonts w:ascii="Times New Roman" w:eastAsia="Times New Roman" w:hAnsi="Times New Roman" w:cs="Times New Roman"/>
-          <w:sz w:val="24"/>
-          <w:szCs w:val="24"/>
-        </w:rPr>
-        <w:t>4</w:t>
-      </w:r>
-      <w:r>
-        <w:rPr>
-          <w:rFonts w:ascii="Times New Roman" w:eastAsia="Times New Roman" w:hAnsi="Times New Roman" w:cs="Times New Roman"/>
-          <w:sz w:val="24"/>
-          <w:szCs w:val="24"/>
-        </w:rPr>
-        <w:t xml:space="preserve"> years of experience designing, developing, and scaling enterprise applications. Skilled in </w:t>
-      </w:r>
-      <w:r>
-        <w:rPr>
-          <w:rFonts w:ascii="Times New Roman" w:eastAsia="Times New Roman" w:hAnsi="Times New Roman" w:cs="Times New Roman"/>
-          <w:b/>
-          <w:bCs/>
-          <w:sz w:val="24"/>
-          <w:szCs w:val="24"/>
-        </w:rPr>
-        <w:t>backend and full-stack development</w:t>
-      </w:r>
-      <w:r>
-        <w:rPr>
-          <w:rFonts w:ascii="Times New Roman" w:eastAsia="Times New Roman" w:hAnsi="Times New Roman" w:cs="Times New Roman"/>
-          <w:sz w:val="24"/>
-          <w:szCs w:val="24"/>
-        </w:rPr>
-        <w:t xml:space="preserve">, with expertise in </w:t>
-      </w:r>
-      <w:r>
-        <w:rPr>
-          <w:rFonts w:ascii="Times New Roman" w:eastAsia="Times New Roman" w:hAnsi="Times New Roman" w:cs="Times New Roman"/>
-          <w:b/>
-          <w:bCs/>
-          <w:sz w:val="24"/>
-          <w:szCs w:val="24"/>
-        </w:rPr>
-        <w:t>Java (Spring Boot), C#, Python, and TypeScript/Angular</w:t>
-      </w:r>
-      <w:r>
-        <w:rPr>
-          <w:rFonts w:ascii="Times New Roman" w:eastAsia="Times New Roman" w:hAnsi="Times New Roman" w:cs="Times New Roman"/>
-          <w:sz w:val="24"/>
-          <w:szCs w:val="24"/>
-        </w:rPr>
-        <w:t xml:space="preserve">. Adept at </w:t>
-      </w:r>
-      <w:r>
-        <w:rPr>
-          <w:rFonts w:ascii="Times New Roman" w:eastAsia="Times New Roman" w:hAnsi="Times New Roman" w:cs="Times New Roman"/>
-          <w:b/>
-          <w:bCs/>
-          <w:sz w:val="24"/>
-          <w:szCs w:val="24"/>
-        </w:rPr>
-        <w:t>high-level and low-level system design, DevOps delivery models, and cloud-native deployments (AWS, Azure, Kubernetes)</w:t>
-      </w:r>
-      <w:r>
-        <w:rPr>
-          <w:rFonts w:ascii="Times New Roman" w:eastAsia="Times New Roman" w:hAnsi="Times New Roman" w:cs="Times New Roman"/>
-          <w:sz w:val="24"/>
-          <w:szCs w:val="24"/>
-        </w:rPr>
-        <w:t xml:space="preserve">. Strong track record of building </w:t>
-      </w:r>
-      <w:r>
-        <w:rPr>
-          <w:rFonts w:ascii="Times New Roman" w:eastAsia="Times New Roman" w:hAnsi="Times New Roman" w:cs="Times New Roman"/>
-          <w:b/>
-          <w:bCs/>
-          <w:sz w:val="24"/>
-          <w:szCs w:val="24"/>
-        </w:rPr>
-        <w:t>resilient, scalable, and cost-optimized systems</w:t>
-      </w:r>
-      <w:r>
-        <w:rPr>
-          <w:rFonts w:ascii="Times New Roman" w:eastAsia="Times New Roman" w:hAnsi="Times New Roman" w:cs="Times New Roman"/>
-          <w:sz w:val="24"/>
-          <w:szCs w:val="24"/>
-        </w:rPr>
-        <w:t xml:space="preserve"> with RESTful APIs, Kafka-based event-driven architectures, and automated CI/CD pipelines. Experienced in working across product, business, and tech teams to deliver secure, high-performance, and user-friendly solutions that impact millions of users.</w:t>
+          <w:sz w:val="24"/>
+          <w:szCs w:val="24"/>
+        </w:rPr>
+        <w:t>.</w:t>
       </w:r>
       <w:r>
         <w:rPr>
@@ -513,7 +395,7 @@
           <w:sz w:val="24"/>
           <w:szCs w:val="24"/>
         </w:rPr>
-        <w:t>Cloud &amp; DevOps:</w:t>
+        <w:t>Generative AI:</w:t>
       </w:r>
       <w:r>
         <w:rPr>
@@ -521,7 +403,7 @@
           <w:sz w:val="24"/>
           <w:szCs w:val="24"/>
         </w:rPr>
-        <w:t xml:space="preserve"> AWS (Lambda, EC2, RDS, S3, CloudFront, EKS, CloudWatch), Docker, Kubernetes, Terraform, Jenkins, GitHub Actions</w:t>
+        <w:t xml:space="preserve"> Azure OpenAI (GPT-4/4o), Prompt Engineering</w:t>
       </w:r>
     </w:p>
     <w:p>
@@ -545,7 +427,7 @@
           <w:sz w:val="24"/>
           <w:szCs w:val="24"/>
         </w:rPr>
-        <w:t>Messaging/Event Streaming:</w:t>
+        <w:t>Cloud &amp; DevOps:</w:t>
       </w:r>
       <w:r>
         <w:rPr>
@@ -553,7 +435,7 @@
           <w:sz w:val="24"/>
           <w:szCs w:val="24"/>
         </w:rPr>
-        <w:t xml:space="preserve"> Apache Kafka</w:t>
+        <w:t xml:space="preserve"> AWS (Lambda, EC2, RDS, S3, CloudFront, EKS, CloudWatch), Docker, Kubernetes, Terraform, Jenkins, GitHub Actions</w:t>
       </w:r>
     </w:p>
     <w:p>
@@ -577,7 +459,7 @@
           <w:sz w:val="24"/>
           <w:szCs w:val="24"/>
         </w:rPr>
-        <w:t>Web Services:</w:t>
+        <w:t>Messaging/Event Streaming:</w:t>
       </w:r>
       <w:r>
         <w:rPr>
@@ -585,7 +467,7 @@
           <w:sz w:val="24"/>
           <w:szCs w:val="24"/>
         </w:rPr>
-        <w:t xml:space="preserve"> RESTful APIs, JSON, XML</w:t>
+        <w:t xml:space="preserve"> Apache Kafka</w:t>
       </w:r>
     </w:p>
     <w:p>
@@ -609,7 +491,7 @@
           <w:sz w:val="24"/>
           <w:szCs w:val="24"/>
         </w:rPr>
-        <w:t>Databases:</w:t>
+        <w:t>Web Services:</w:t>
       </w:r>
       <w:r>
         <w:rPr>
@@ -617,7 +499,7 @@
           <w:sz w:val="24"/>
           <w:szCs w:val="24"/>
         </w:rPr>
-        <w:t xml:space="preserve"> PostgreSQL, Oracle, MySQL, PL/SQL</w:t>
+        <w:t xml:space="preserve"> RESTful APIs, JSON, XML</w:t>
       </w:r>
     </w:p>
     <w:p>
@@ -641,25 +523,15 @@
           <w:sz w:val="24"/>
           <w:szCs w:val="24"/>
         </w:rPr>
-        <w:t>Testing:</w:t>
+        <w:t>Databases:</w:t>
       </w:r>
       <w:r>
         <w:rPr>
           <w:rFonts w:ascii="Times New Roman" w:eastAsia="Times New Roman" w:hAnsi="Times New Roman" w:cs="Times New Roman"/>
-          <w:b/>
-          <w:bCs/>
-          <w:sz w:val="24"/>
-          <w:szCs w:val="24"/>
-        </w:rPr>
-        <w:t xml:space="preserve"> </w:t>
-      </w:r>
-      <w:r>
-        <w:rPr>
-          <w:rFonts w:ascii="Times New Roman" w:eastAsia="Times New Roman" w:hAnsi="Times New Roman" w:cs="Times New Roman"/>
-          <w:sz w:val="24"/>
-          <w:szCs w:val="24"/>
-        </w:rPr>
-        <w:t>Selenium, Jasmine, Karma, JUnit, TDD, CI/CD automation</w:t>
+          <w:sz w:val="24"/>
+          <w:szCs w:val="24"/>
+        </w:rPr>
+        <w:t xml:space="preserve"> PostgreSQL, Oracle, MySQL, PL/SQL</w:t>
       </w:r>
     </w:p>
     <w:p>
@@ -683,6 +555,48 @@
           <w:sz w:val="24"/>
           <w:szCs w:val="24"/>
         </w:rPr>
+        <w:t>Testing:</w:t>
+      </w:r>
+      <w:r>
+        <w:rPr>
+          <w:rFonts w:ascii="Times New Roman" w:eastAsia="Times New Roman" w:hAnsi="Times New Roman" w:cs="Times New Roman"/>
+          <w:b/>
+          <w:bCs/>
+          <w:sz w:val="24"/>
+          <w:szCs w:val="24"/>
+        </w:rPr>
+        <w:t xml:space="preserve"> </w:t>
+      </w:r>
+      <w:r>
+        <w:rPr>
+          <w:rFonts w:ascii="Times New Roman" w:eastAsia="Times New Roman" w:hAnsi="Times New Roman" w:cs="Times New Roman"/>
+          <w:sz w:val="24"/>
+          <w:szCs w:val="24"/>
+        </w:rPr>
+        <w:t>Selenium, Jasmine, Karma, JUnit, TDD, CI/CD automation</w:t>
+      </w:r>
+    </w:p>
+    <w:p>
+      <w:pPr>
+        <w:numPr>
+          <w:ilvl w:val="0"/>
+          <w:numId w:val="7"/>
+        </w:numPr>
+        <w:spacing w:before="100" w:beforeAutospacing="1" w:after="100" w:afterAutospacing="1" w:line="240" w:lineRule="auto"/>
+        <w:rPr>
+          <w:rFonts w:ascii="Times New Roman" w:eastAsia="Times New Roman" w:hAnsi="Times New Roman" w:cs="Times New Roman"/>
+          <w:sz w:val="24"/>
+          <w:szCs w:val="24"/>
+        </w:rPr>
+      </w:pPr>
+      <w:r>
+        <w:rPr>
+          <w:rFonts w:ascii="Times New Roman" w:eastAsia="Times New Roman" w:hAnsi="Times New Roman" w:cs="Times New Roman"/>
+          <w:b/>
+          <w:bCs/>
+          <w:sz w:val="24"/>
+          <w:szCs w:val="24"/>
+        </w:rPr>
         <w:t>Tools:</w:t>
       </w:r>
       <w:r>
@@ -691,25 +605,7 @@
           <w:sz w:val="24"/>
           <w:szCs w:val="24"/>
         </w:rPr>
-        <w:t xml:space="preserve"> Git, SVN, Postman, Apache </w:t>
-      </w:r>
-      <w:proofErr w:type="spellStart"/>
-      <w:r>
-        <w:rPr>
-          <w:rFonts w:ascii="Times New Roman" w:eastAsia="Times New Roman" w:hAnsi="Times New Roman" w:cs="Times New Roman"/>
-          <w:sz w:val="24"/>
-          <w:szCs w:val="24"/>
-        </w:rPr>
-        <w:t>NiFi</w:t>
-      </w:r>
-      <w:proofErr w:type="spellEnd"/>
-      <w:r>
-        <w:rPr>
-          <w:rFonts w:ascii="Times New Roman" w:eastAsia="Times New Roman" w:hAnsi="Times New Roman" w:cs="Times New Roman"/>
-          <w:sz w:val="24"/>
-          <w:szCs w:val="24"/>
-        </w:rPr>
-        <w:t>, ELK Stack</w:t>
+        <w:t xml:space="preserve"> Git, SVN, Postman, Apache NiFi, ELK Stack</w:t>
       </w:r>
     </w:p>
     <w:p>
@@ -845,20 +741,8 @@
           <w:sz w:val="24"/>
           <w:szCs w:val="24"/>
         </w:rPr>
-        <w:t xml:space="preserve">Java Spring Boot microservices integrated with Angular </w:t>
+        <w:t>Java Spring Boot microservices integrated with Angular front-ends</w:t>
       </w:r>
-      <w:proofErr w:type="gramStart"/>
-      <w:r>
-        <w:rPr>
-          <w:rFonts w:ascii="Times New Roman" w:eastAsia="Times New Roman" w:hAnsi="Times New Roman" w:cs="Times New Roman"/>
-          <w:b/>
-          <w:bCs/>
-          <w:sz w:val="24"/>
-          <w:szCs w:val="24"/>
-        </w:rPr>
-        <w:t>front-ends</w:t>
-      </w:r>
-      <w:proofErr w:type="gramEnd"/>
       <w:r>
         <w:rPr>
           <w:rFonts w:ascii="Times New Roman" w:eastAsia="Times New Roman" w:hAnsi="Times New Roman" w:cs="Times New Roman"/>
@@ -887,25 +771,7 @@
           <w:sz w:val="24"/>
           <w:szCs w:val="24"/>
         </w:rPr>
-        <w:t xml:space="preserve">Created </w:t>
-      </w:r>
-      <w:r>
-        <w:rPr>
-          <w:rFonts w:ascii="Times New Roman" w:eastAsia="Times New Roman" w:hAnsi="Times New Roman" w:cs="Times New Roman"/>
-          <w:b/>
-          <w:bCs/>
-          <w:sz w:val="24"/>
-          <w:szCs w:val="24"/>
-        </w:rPr>
-        <w:t>RESTful APIs</w:t>
-      </w:r>
-      <w:r>
-        <w:rPr>
-          <w:rFonts w:ascii="Times New Roman" w:eastAsia="Times New Roman" w:hAnsi="Times New Roman" w:cs="Times New Roman"/>
-          <w:sz w:val="24"/>
-          <w:szCs w:val="24"/>
-        </w:rPr>
-        <w:t xml:space="preserve"> for seamless integration between Angular UI and backend services.</w:t>
+        <w:t>Hands-on experience implementing Generative AI solutions using Azure OpenAI, GPT-4, and prompt-driven automation to accelerate development workflows.</w:t>
       </w:r>
     </w:p>
     <w:p>
@@ -927,7 +793,7 @@
           <w:sz w:val="24"/>
           <w:szCs w:val="24"/>
         </w:rPr>
-        <w:t xml:space="preserve">Enhanced user experience by implementing </w:t>
+        <w:t xml:space="preserve">Created </w:t>
       </w:r>
       <w:r>
         <w:rPr>
@@ -937,7 +803,7 @@
           <w:sz w:val="24"/>
           <w:szCs w:val="24"/>
         </w:rPr>
-        <w:t>responsive, dynamic Angular features</w:t>
+        <w:t>RESTful APIs</w:t>
       </w:r>
       <w:r>
         <w:rPr>
@@ -945,7 +811,7 @@
           <w:sz w:val="24"/>
           <w:szCs w:val="24"/>
         </w:rPr>
-        <w:t xml:space="preserve"> using TypeScript, Bootstrap, and HTML/CSS.</w:t>
+        <w:t xml:space="preserve"> for seamless integration between Angular UI and backend services.</w:t>
       </w:r>
     </w:p>
     <w:p>
@@ -968,7 +834,7 @@
           <w:szCs w:val="24"/>
         </w:rPr>
         <w:lastRenderedPageBreak/>
-        <w:t xml:space="preserve">Implemented </w:t>
+        <w:t xml:space="preserve">Enhanced user experience by implementing </w:t>
       </w:r>
       <w:r>
         <w:rPr>
@@ -978,7 +844,7 @@
           <w:sz w:val="24"/>
           <w:szCs w:val="24"/>
         </w:rPr>
-        <w:t>Kafka-based event-driven communication</w:t>
+        <w:t>responsive, dynamic Angular features</w:t>
       </w:r>
       <w:r>
         <w:rPr>
@@ -986,7 +852,7 @@
           <w:sz w:val="24"/>
           <w:szCs w:val="24"/>
         </w:rPr>
-        <w:t xml:space="preserve"> to support real-time updates in UI dashboards.</w:t>
+        <w:t xml:space="preserve"> using TypeScript, Bootstrap, and HTML/CSS.</w:t>
       </w:r>
     </w:p>
     <w:p>
@@ -1315,7 +1181,6 @@
         </w:rPr>
         <w:t xml:space="preserve">Enforced </w:t>
       </w:r>
-      <w:proofErr w:type="spellStart"/>
       <w:r>
         <w:rPr>
           <w:rFonts w:ascii="Times New Roman" w:eastAsia="Times New Roman" w:hAnsi="Times New Roman" w:cs="Times New Roman"/>
@@ -1324,18 +1189,7 @@
           <w:sz w:val="24"/>
           <w:szCs w:val="24"/>
         </w:rPr>
-        <w:t>DevSecOps</w:t>
-      </w:r>
-      <w:proofErr w:type="spellEnd"/>
-      <w:r>
-        <w:rPr>
-          <w:rFonts w:ascii="Times New Roman" w:eastAsia="Times New Roman" w:hAnsi="Times New Roman" w:cs="Times New Roman"/>
-          <w:b/>
-          <w:bCs/>
-          <w:sz w:val="24"/>
-          <w:szCs w:val="24"/>
-        </w:rPr>
-        <w:t xml:space="preserve"> best practices</w:t>
+        <w:t>DevSecOps best practices</w:t>
       </w:r>
       <w:r>
         <w:rPr>
@@ -1375,29 +1229,7 @@
           <w:sz w:val="24"/>
           <w:szCs w:val="24"/>
         </w:rPr>
-        <w:t>end-</w:t>
-      </w:r>
-      <w:proofErr w:type="gramStart"/>
-      <w:r>
-        <w:rPr>
-          <w:rFonts w:ascii="Times New Roman" w:eastAsia="Times New Roman" w:hAnsi="Times New Roman" w:cs="Times New Roman"/>
-          <w:b/>
-          <w:bCs/>
-          <w:sz w:val="24"/>
-          <w:szCs w:val="24"/>
-        </w:rPr>
-        <w:t>to</w:t>
-      </w:r>
-      <w:proofErr w:type="gramEnd"/>
-      <w:r>
-        <w:rPr>
-          <w:rFonts w:ascii="Times New Roman" w:eastAsia="Times New Roman" w:hAnsi="Times New Roman" w:cs="Times New Roman"/>
-          <w:b/>
-          <w:bCs/>
-          <w:sz w:val="24"/>
-          <w:szCs w:val="24"/>
-        </w:rPr>
-        <w:t>-end UI tests</w:t>
+        <w:t>end-to-end UI tests</w:t>
       </w:r>
       <w:r>
         <w:rPr>
@@ -3272,7 +3104,6 @@
   <w:style w:type="character" w:default="1" w:styleId="DefaultParagraphFont">
     <w:name w:val="Default Paragraph Font"/>
     <w:uiPriority w:val="1"/>
-    <w:semiHidden/>
     <w:unhideWhenUsed/>
   </w:style>
   <w:style w:type="table" w:default="1" w:styleId="TableNormal">

</xml_diff>

<commit_message>
Add custom role creation and template mapping
</commit_message>
<xml_diff>
--- a/auto-emailer-linkedin/assets/Rithwik_Raj_Mallam__Resume.docx
+++ b/auto-emailer-linkedin/assets/Rithwik_Raj_Mallam__Resume.docx
@@ -234,7 +234,61 @@
           <w:sz w:val="24"/>
           <w:szCs w:val="24"/>
         </w:rPr>
-        <w:t>Innovative and results-driven Software Development Engineer with 4 years of experience delivering enterprise-scale applications across full-stack and backend environments. Skilled in Java (Spring Boot), C#, Python, and Angular, with additional experience leveraging Generative AI and LLM technologies such as Azure OpenAI, RAG, and prompt engineering to enhance automation and developer productivity. Adept at system design, cloud-native deployments (AWS, Azure, Kubernetes), and building resilient applications using RESTful APIs, Kafka event-driven architectures, and end-to-end CI/CD pipelines. Strong collaborator with product, business, and engineering teams to deliver secure, scalable, and user-focused solutions</w:t>
+        <w:t xml:space="preserve">Backend Software Engineer with 4 years of experience building scalable, cloud-ready API-driven applications using </w:t>
+      </w:r>
+      <w:r>
+        <w:rPr>
+          <w:rFonts w:ascii="Times New Roman" w:eastAsia="Times New Roman" w:hAnsi="Times New Roman" w:cs="Times New Roman"/>
+          <w:b/>
+          <w:bCs/>
+          <w:sz w:val="24"/>
+          <w:szCs w:val="24"/>
+        </w:rPr>
+        <w:t>Python, Java, SQL, and modern backend frameworks</w:t>
+      </w:r>
+      <w:r>
+        <w:rPr>
+          <w:rFonts w:ascii="Times New Roman" w:eastAsia="Times New Roman" w:hAnsi="Times New Roman" w:cs="Times New Roman"/>
+          <w:sz w:val="24"/>
+          <w:szCs w:val="24"/>
+        </w:rPr>
+        <w:t xml:space="preserve">. Strong expertise in </w:t>
+      </w:r>
+      <w:r>
+        <w:rPr>
+          <w:rFonts w:ascii="Times New Roman" w:eastAsia="Times New Roman" w:hAnsi="Times New Roman" w:cs="Times New Roman"/>
+          <w:b/>
+          <w:bCs/>
+          <w:sz w:val="24"/>
+          <w:szCs w:val="24"/>
+        </w:rPr>
+        <w:t>REST API design</w:t>
+      </w:r>
+      <w:r>
+        <w:rPr>
+          <w:rFonts w:ascii="Times New Roman" w:eastAsia="Times New Roman" w:hAnsi="Times New Roman" w:cs="Times New Roman"/>
+          <w:sz w:val="24"/>
+          <w:szCs w:val="24"/>
+        </w:rPr>
+        <w:t xml:space="preserve">, relational databases, distributed systems, and cloud services (AWS/Azure). Hands-on with </w:t>
+      </w:r>
+      <w:r>
+        <w:rPr>
+          <w:rFonts w:ascii="Times New Roman" w:eastAsia="Times New Roman" w:hAnsi="Times New Roman" w:cs="Times New Roman"/>
+          <w:b/>
+          <w:bCs/>
+          <w:sz w:val="24"/>
+          <w:szCs w:val="24"/>
+        </w:rPr>
+        <w:t>Python FastAPI/Flask</w:t>
+      </w:r>
+      <w:r>
+        <w:rPr>
+          <w:rFonts w:ascii="Times New Roman" w:eastAsia="Times New Roman" w:hAnsi="Times New Roman" w:cs="Times New Roman"/>
+          <w:sz w:val="24"/>
+          <w:szCs w:val="24"/>
+        </w:rPr>
+        <w:t>, asynchronous processing, and microservices architecture. Proven track record of improving backend performance, optimizing database queries, and integrating third-party APIs. Experienced collaborating with cross-functional teams to deliver secure, maintainable, and production-ready backend systems</w:t>
       </w:r>
       <w:r>
         <w:rPr>

</xml_diff>